<commit_message>
docs: cap nhat bao cao lab 7 theo main moi nhat
</commit_message>
<xml_diff>
--- a/docs/thanh-vien/Lab07_2312777_NguyenVietToan.docx
+++ b/docs/thanh-vien/Lab07_2312777_NguyenVietToan.docx
@@ -657,22 +657,16 @@
     </w:p>
     <w:p>
       <w:pPr>
-        <w:spacing w:after="40"/>
+        <w:keepNext w:val="0"/>
+        <w:keepLines w:val="0"/>
+        <w:widowControl w:val="0"/>
+        <w:spacing w:after="0" w:before="0" w:line="240" w:lineRule="auto"/>
       </w:pPr>
       <w:r>
         <w:rPr>
-          <w:rFonts w:ascii="Times New Roman" w:hAnsi="Times New Roman"/>
-          <w:b/>
-          <w:sz w:val="22"/>
+          <w:sz w:val="20"/>
         </w:rPr>
-        <w:t xml:space="preserve">Trạng thái nộp: </w:t>
-      </w:r>
-      <w:r>
-        <w:rPr>
-          <w:rFonts w:ascii="Times New Roman" w:hAnsi="Times New Roman"/>
-          <w:sz w:val="22"/>
-        </w:rPr>
-        <w:t>Đã push nhánh 2312777-NguyenVietToan-buoi7 và tạo Pull Request số 38; đang chờ trưởng nhóm review và merge vào main.</w:t>
+        <w:t>Cập nhật trạng thái (28/10/2026): Đã push nhánh 2312777-NguyenVietToan-buoi7; Pull Request số 38 đã được trưởng nhóm review và merge vào main tại commit 8345ad4. Repository hiện ở main@7843065. Các mục R12, R15, R16, R17, C01, O02, P02 và U04/D02 thuộc rà soát trước Lab 8, không tính vào Lab 7 và chưa đánh dấu hoàn thành.</w:t>
       </w:r>
     </w:p>
     <w:sectPr>

</xml_diff>